<commit_message>
Paper 1 v0.6: Word review and dashboard rendered again without the figures' attribute text
The first Word review and dashboard of the 27 October run printed each figure's pandoc attribute block
({width=100% alt="..."}) under the image. Rendered again from the same inventory and corrected version with
manuscript-skills 0.33.1, which reads the block as the figure's alt text. The review is uploaded to the v0.6 Drive
folder as a Google Doc, beside the changes workbook as a Google Sheet.

Co-Authored-By: Claude Opus 5.5 <noreply@anthropic.com>
</commit_message>
<xml_diff>
--- a/docs/manuscript/v0.6/paper1-just-dna-lite.review.docx
+++ b/docs/manuscript/v0.6/paper1-just-dna-lite.review.docx
@@ -1406,7 +1406,7 @@
         <w:drawing>
           <wp:inline xmlns:a="http://schemas.openxmlformats.org/drawingml/2006/main" xmlns:pic="http://schemas.openxmlformats.org/drawingml/2006/picture">
             <wp:extent cx="5486400" cy="6990430"/>
-            <wp:docPr id="1" name="Picture 1"/>
+            <wp:docPr id="1" name="Picture 1" descr="Two screenshots of the Just-DNA-Lite web interface. Top: the Module Catalog, with a panel for the selected Longevity Map module beside a grid of module cards, each with a Details and a Get button. Bottom: the Longevity Variants section of a report, with summary cards above a table of variants; a FOXO3 row is open to the module's conclusion, method, direction and priority and to a table of supporting studies with their PubMed IDs, populations, study designs and conclusions."/>
             <wp:cNvGraphicFramePr>
               <a:graphicFrameLocks noChangeAspect="1"/>
             </wp:cNvGraphicFramePr>
@@ -1435,18 +1435,6 @@
             </a:graphic>
           </wp:inline>
         </w:drawing>
-      </w:r>
-      <w:r>
-        <w:rPr/>
-        <w:t>{width=100% alt="Two screenshots of the Just-DNA-Lite web interface.</w:t>
-      </w:r>
-      <w:r>
-        <w:rPr/>
-        <w:t xml:space="preserve"> Top: the Module Catalog, with a panel for the selected Longevity Map module beside a grid of module cards, each with a Details and a Get button.</w:t>
-      </w:r>
-      <w:r>
-        <w:rPr/>
-        <w:t xml:space="preserve"> Bottom: the Longevity Variants section of a report, with summary cards above a table of variants; a FOXO3 row is open to the module's conclusion, method, direction and priority and to a table of supporting studies with their PubMed IDs, populations, study designs and conclusions."}</w:t>
       </w:r>
     </w:p>
     <w:p>
@@ -2201,7 +2189,7 @@
         <w:drawing>
           <wp:inline xmlns:a="http://schemas.openxmlformats.org/drawingml/2006/main" xmlns:pic="http://schemas.openxmlformats.org/drawingml/2006/picture">
             <wp:extent cx="5486400" cy="4082902"/>
-            <wp:docPr id="2" name="Picture 2"/>
+            <wp:docPr id="2" name="Picture 2" descr="Diagram of three boxes linked by arrows. The called-genotype box gives FOXO3 rs2802292, genotype G/T, called, from Anton Kulaga's public genome on GRCh38. One arrow leads down to the report annotation: category insulin signalling, displayed direction Protective and curation weight 0.475, with the note that a curation weight does not quantify a change in lifespan. Another arrow leads right to the linked study records, five populations with their PubMed IDs, and an excerpt of the stored Danish-study conclusion."/>
             <wp:cNvGraphicFramePr>
               <a:graphicFrameLocks noChangeAspect="1"/>
             </wp:cNvGraphicFramePr>
@@ -2231,22 +2219,6 @@
           </wp:inline>
         </w:drawing>
       </w:r>
-      <w:r>
-        <w:rPr/>
-        <w:t>{width=100% alt="Diagram of three boxes linked by arrows.</w:t>
-      </w:r>
-      <w:r>
-        <w:rPr/>
-        <w:t xml:space="preserve"> The called-genotype box gives FOXO3 rs2802292, genotype G/T, called, from Anton Kulaga's public genome on GRCh38.</w:t>
-      </w:r>
-      <w:r>
-        <w:rPr/>
-        <w:t xml:space="preserve"> One arrow leads down to the report annotation: category insulin signalling, displayed direction Protective and curation weight 0.475, with the note that a curation weight does not quantify a change in lifespan.</w:t>
-      </w:r>
-      <w:r>
-        <w:rPr/>
-        <w:t xml:space="preserve"> Another arrow leads right to the linked study records, five populations with their PubMed IDs, and an excerpt of the stored Danish-study conclusion."}</w:t>
-      </w:r>
     </w:p>
     <w:p>
       <w:r>
@@ -2524,7 +2496,7 @@
         <w:drawing>
           <wp:inline xmlns:a="http://schemas.openxmlformats.org/drawingml/2006/main" xmlns:pic="http://schemas.openxmlformats.org/drawingml/2006/picture">
             <wp:extent cx="5486400" cy="6481672"/>
-            <wp:docPr id="3" name="Picture 3"/>
+            <wp:docPr id="3" name="Picture 3" descr="Screenshot of a polygenic score trait report for LDL cholesterol. Under the title, buttons ask four AI assistants about the result, and summary cards give the median percentile, the most reliable model, the number of models, absolute risk and the spread of percentiles. A chart places each model as a dot on a normal density curve by its standardized score, with a red vertical line at the median. A table below lists models with their PGS ID, reported trait, percentile, matched variants, match percentage and quality label."/>
             <wp:cNvGraphicFramePr>
               <a:graphicFrameLocks noChangeAspect="1"/>
             </wp:cNvGraphicFramePr>
@@ -2553,22 +2525,6 @@
             </a:graphic>
           </wp:inline>
         </w:drawing>
-      </w:r>
-      <w:r>
-        <w:rPr/>
-        <w:t>{width=100% alt="Screenshot of a polygenic score trait report for LDL cholesterol.</w:t>
-      </w:r>
-      <w:r>
-        <w:rPr/>
-        <w:t xml:space="preserve"> Under the title, buttons ask four AI assistants about the result, and summary cards give the median percentile, the most reliable model, the number of models, absolute risk and the spread of percentiles.</w:t>
-      </w:r>
-      <w:r>
-        <w:rPr/>
-        <w:t xml:space="preserve"> A chart places each model as a dot on a normal density curve by its standardized score, with a red vertical line at the median.</w:t>
-      </w:r>
-      <w:r>
-        <w:rPr/>
-        <w:t xml:space="preserve"> A table below lists models with their PGS ID, reported trait, percentile, matched variants, match percentage and quality label."}</w:t>
       </w:r>
     </w:p>
     <w:p>
@@ -7391,7 +7347,7 @@
 
 <file path=word/comments.xml><?xml version="1.0" encoding="utf-8"?>
 <w:comments xmlns:a="http://schemas.openxmlformats.org/drawingml/2006/main" xmlns:pic="http://schemas.openxmlformats.org/drawingml/2006/picture" xmlns:r="http://schemas.openxmlformats.org/officeDocument/2006/relationships" xmlns:w="http://schemas.openxmlformats.org/wordprocessingml/2006/main" xmlns:wp="http://schemas.openxmlformats.org/drawingml/2006/wordprocessingDrawing" xmlns:mc="http://schemas.openxmlformats.org/markup-compatibility/2006" xmlns:a14="http://schemas.microsoft.com/office/drawing/2010/main" xmlns:w14="http://schemas.microsoft.com/office/word/2010/wordml" xmlns:wpc="http://schemas.microsoft.com/office/word/2010/wordprocessingCanvas">
-  <w:comment w:id="0" w:author="Decisions for the authors" w:initials="DF" w:date="2026-10-27T20:36:36Z">
+  <w:comment w:id="0" w:author="Decisions for the authors" w:initials="DF" w:date="2026-10-27T20:51:14Z">
     <w:p>
       <w:pPr>
         <w:pStyle w:val="CommentText"/>
@@ -7407,7 +7363,7 @@
       </w:r>
     </w:p>
   </w:comment>
-  <w:comment w:id="1" w:author="Decisions for the authors" w:initials="DF" w:date="2026-10-27T20:36:36Z">
+  <w:comment w:id="1" w:author="Decisions for the authors" w:initials="DF" w:date="2026-10-27T20:51:14Z">
     <w:p>
       <w:pPr>
         <w:pStyle w:val="CommentText"/>
@@ -7423,7 +7379,7 @@
       </w:r>
     </w:p>
   </w:comment>
-  <w:comment w:id="2" w:author="Decisions for the authors" w:initials="DF" w:date="2026-10-27T20:36:36Z">
+  <w:comment w:id="2" w:author="Decisions for the authors" w:initials="DF" w:date="2026-10-27T20:51:14Z">
     <w:p>
       <w:pPr>
         <w:pStyle w:val="CommentText"/>
@@ -7439,7 +7395,7 @@
       </w:r>
     </w:p>
   </w:comment>
-  <w:comment w:id="3" w:author="Decisions for the authors" w:initials="DF" w:date="2026-10-27T20:36:36Z">
+  <w:comment w:id="3" w:author="Decisions for the authors" w:initials="DF" w:date="2026-10-27T20:51:14Z">
     <w:p>
       <w:pPr>
         <w:pStyle w:val="CommentText"/>
@@ -7455,7 +7411,7 @@
       </w:r>
     </w:p>
   </w:comment>
-  <w:comment w:id="4" w:author="Decisions for the authors" w:initials="DF" w:date="2026-10-27T20:36:36Z">
+  <w:comment w:id="4" w:author="Decisions for the authors" w:initials="DF" w:date="2026-10-27T20:51:14Z">
     <w:p>
       <w:pPr>
         <w:pStyle w:val="CommentText"/>
@@ -7471,7 +7427,7 @@
       </w:r>
     </w:p>
   </w:comment>
-  <w:comment w:id="5" w:author="Decisions for the authors" w:initials="DF" w:date="2026-10-27T20:36:36Z">
+  <w:comment w:id="5" w:author="Decisions for the authors" w:initials="DF" w:date="2026-10-27T20:51:14Z">
     <w:p>
       <w:pPr>
         <w:pStyle w:val="CommentText"/>
@@ -7487,7 +7443,7 @@
       </w:r>
     </w:p>
   </w:comment>
-  <w:comment w:id="6" w:author="Decisions for the authors" w:initials="DF" w:date="2026-10-27T20:36:36Z">
+  <w:comment w:id="6" w:author="Decisions for the authors" w:initials="DF" w:date="2026-10-27T20:51:14Z">
     <w:p>
       <w:pPr>
         <w:pStyle w:val="CommentText"/>
@@ -7503,7 +7459,7 @@
       </w:r>
     </w:p>
   </w:comment>
-  <w:comment w:id="7" w:author="Decisions for the authors" w:initials="DF" w:date="2026-10-27T20:36:36Z">
+  <w:comment w:id="7" w:author="Decisions for the authors" w:initials="DF" w:date="2026-10-27T20:51:14Z">
     <w:p>
       <w:pPr>
         <w:pStyle w:val="CommentText"/>
@@ -7519,7 +7475,7 @@
       </w:r>
     </w:p>
   </w:comment>
-  <w:comment w:id="8" w:author="Decisions for the authors" w:initials="DF" w:date="2026-10-27T20:36:36Z">
+  <w:comment w:id="8" w:author="Decisions for the authors" w:initials="DF" w:date="2026-10-27T20:51:14Z">
     <w:p>
       <w:pPr>
         <w:pStyle w:val="CommentText"/>
@@ -7535,7 +7491,7 @@
       </w:r>
     </w:p>
   </w:comment>
-  <w:comment w:id="9" w:author="Decisions for the authors" w:initials="DF" w:date="2026-10-27T20:36:36Z">
+  <w:comment w:id="9" w:author="Decisions for the authors" w:initials="DF" w:date="2026-10-27T20:51:14Z">
     <w:p>
       <w:pPr>
         <w:pStyle w:val="CommentText"/>
@@ -7551,7 +7507,7 @@
       </w:r>
     </w:p>
   </w:comment>
-  <w:comment w:id="10" w:author="Decisions for the authors" w:initials="DF" w:date="2026-10-27T20:36:36Z">
+  <w:comment w:id="10" w:author="Decisions for the authors" w:initials="DF" w:date="2026-10-27T20:51:14Z">
     <w:p>
       <w:pPr>
         <w:pStyle w:val="CommentText"/>
@@ -7567,7 +7523,7 @@
       </w:r>
     </w:p>
   </w:comment>
-  <w:comment w:id="11" w:author="Decisions for the authors" w:initials="DF" w:date="2026-10-27T20:36:36Z">
+  <w:comment w:id="11" w:author="Decisions for the authors" w:initials="DF" w:date="2026-10-27T20:51:14Z">
     <w:p>
       <w:pPr>
         <w:pStyle w:val="CommentText"/>
@@ -7583,7 +7539,7 @@
       </w:r>
     </w:p>
   </w:comment>
-  <w:comment w:id="12" w:author="Decisions for the authors" w:initials="DF" w:date="2026-10-27T20:36:36Z">
+  <w:comment w:id="12" w:author="Decisions for the authors" w:initials="DF" w:date="2026-10-27T20:51:14Z">
     <w:p>
       <w:pPr>
         <w:pStyle w:val="CommentText"/>
@@ -7599,7 +7555,7 @@
       </w:r>
     </w:p>
   </w:comment>
-  <w:comment w:id="13" w:author="Decisions for the authors" w:initials="DF" w:date="2026-10-27T20:36:36Z">
+  <w:comment w:id="13" w:author="Decisions for the authors" w:initials="DF" w:date="2026-10-27T20:51:14Z">
     <w:p>
       <w:pPr>
         <w:pStyle w:val="CommentText"/>
@@ -7615,7 +7571,7 @@
       </w:r>
     </w:p>
   </w:comment>
-  <w:comment w:id="14" w:author="Decisions for the authors" w:initials="DF" w:date="2026-10-27T20:36:36Z">
+  <w:comment w:id="14" w:author="Decisions for the authors" w:initials="DF" w:date="2026-10-27T20:51:14Z">
     <w:p>
       <w:pPr>
         <w:pStyle w:val="CommentText"/>
@@ -7631,7 +7587,7 @@
       </w:r>
     </w:p>
   </w:comment>
-  <w:comment w:id="15" w:author="Figures and tables" w:initials="FA" w:date="2026-10-27T20:36:36Z">
+  <w:comment w:id="15" w:author="Figures and tables" w:initials="FA" w:date="2026-10-27T20:51:14Z">
     <w:p>
       <w:pPr>
         <w:pStyle w:val="CommentText"/>
@@ -7647,7 +7603,7 @@
       </w:r>
     </w:p>
   </w:comment>
-  <w:comment w:id="16" w:author="Workflow" w:initials="W" w:date="2026-10-27T20:36:36Z">
+  <w:comment w:id="16" w:author="Workflow" w:initials="W" w:date="2026-10-27T20:51:14Z">
     <w:p>
       <w:pPr>
         <w:pStyle w:val="CommentText"/>

</xml_diff>